<commit_message>
feat(C209): update courseware from WSQ parent v2.5
Replicates TGS-2024045801 v2.5 (WSQ source commit 7495ebf) as the
non-WSQ twin, superseding the v2.0 set.

- Deck v2.5: 131 -> 120 slides. Dropped digital attendance, TSC (x2),
  learning outcomes, funding criteria, assessment briefing/assessment/
  flow (x2) and the tea-break slide; last attendance slide rewritten as
  Course Feedback. Lunch 30 min, schedule 9:30am-5:30pm, 7.5 h/day.
- LP/LG: Skills Framework, Assessment and TRAQOM content removed; both
  days retimed to 9:30am-5:30pm (tea breaks and assessment rows removed,
  30-min lunch, every topic block keeps its WSQ minutes = 450 min/day);
  slide refs remapped; TOC page numbers refreshed.
- Labs: replaced with the v2.5 lab set (renamed workflow JSON, Telegram
  HR demo workflow).
- LG Markdown mirror rebuilt; image links fixed to courseware/assets/.

Co-Authored-By: Claude Opus 5.5 <noreply@anthropic.com>
</commit_message>
<xml_diff>
--- a/courseware/LP-Automate Business Processes with Agentic AI Workflows (C209).docx
+++ b/courseware/LP-Automate Business Processes with Agentic AI Workflows (C209).docx
@@ -218,7 +218,7 @@
           <w:color w:val="1F6FEB"/>
           <w:sz w:val="24"/>
         </w:rPr>
-        <w:t>Version 2.0</w:t>
+        <w:t>Version 2.5</w:t>
       </w:r>
     </w:p>
     <w:p>
@@ -328,13 +328,12 @@
             <w:tcW w:type="dxa" w:w="2160"/>
           </w:tcPr>
           <w:p>
-            <w:r>
-              <w:t>1.0</w:t>
-            </w:r>
+            <w:r/>
             <w:r>
               <w:rPr>
                 <w:sz w:val="19"/>
               </w:rPr>
+              <w:t>1.0</w:t>
             </w:r>
           </w:p>
         </w:tc>
@@ -343,13 +342,12 @@
             <w:tcW w:type="dxa" w:w="2160"/>
           </w:tcPr>
           <w:p>
-            <w:r>
-              <w:t>8 August 2026</w:t>
-            </w:r>
+            <w:r/>
             <w:r>
               <w:rPr>
                 <w:sz w:val="19"/>
               </w:rPr>
+              <w:t>8 August 2026</w:t>
             </w:r>
           </w:p>
         </w:tc>
@@ -358,13 +356,12 @@
             <w:tcW w:type="dxa" w:w="2160"/>
           </w:tcPr>
           <w:p>
-            <w:r>
-              <w:t>Derived from the parent course courseware (v2.0): same topics, labs and house design.</w:t>
-            </w:r>
+            <w:r/>
             <w:r>
               <w:rPr>
                 <w:sz w:val="19"/>
               </w:rPr>
+              <w:t>Derived from the parent course courseware (v2.0): same topics, labs and house design.</w:t>
             </w:r>
           </w:p>
         </w:tc>
@@ -373,13 +370,12 @@
             <w:tcW w:type="dxa" w:w="2160"/>
           </w:tcPr>
           <w:p>
-            <w:r>
-              <w:t>Dr. Alfred Ang</w:t>
-            </w:r>
+            <w:r/>
             <w:r>
               <w:rPr>
                 <w:sz w:val="19"/>
               </w:rPr>
+              <w:t>Dr. Alfred Ang</w:t>
             </w:r>
           </w:p>
         </w:tc>
@@ -390,13 +386,12 @@
             <w:tcW w:type="dxa" w:w="2160"/>
           </w:tcPr>
           <w:p>
-            <w:r>
-              <w:t>2.0</w:t>
-            </w:r>
+            <w:r/>
             <w:r>
               <w:rPr>
                 <w:sz w:val="19"/>
               </w:rPr>
+              <w:t>2.0</w:t>
             </w:r>
           </w:p>
         </w:tc>
@@ -405,13 +400,12 @@
             <w:tcW w:type="dxa" w:w="2160"/>
           </w:tcPr>
           <w:p>
-            <w:r>
-              <w:t>19 September 2026</w:t>
-            </w:r>
+            <w:r/>
             <w:r>
               <w:rPr>
                 <w:sz w:val="19"/>
               </w:rPr>
+              <w:t>19 September 2026</w:t>
             </w:r>
           </w:p>
         </w:tc>
@@ -420,13 +414,12 @@
             <w:tcW w:type="dxa" w:w="2160"/>
           </w:tcPr>
           <w:p>
-            <w:r>
-              <w:t>Non-WSQ edition: assessment and funding content removed; both days retimed to 9:30am – 5:30pm (7.5 instructional hours/day, 15 hours total) with a 30-minute lunch break; slide references remapped.</w:t>
-            </w:r>
+            <w:r/>
             <w:r>
               <w:rPr>
                 <w:sz w:val="19"/>
               </w:rPr>
+              <w:t>Non-WSQ edition: assessment and funding content removed; both days retimed to 9:30am – 5:30pm (7.5 instructional hours/day, 15 hours total) with a 30-minute lunch break; slide references remapped.</w:t>
             </w:r>
           </w:p>
         </w:tc>
@@ -435,13 +428,70 @@
             <w:tcW w:type="dxa" w:w="2160"/>
           </w:tcPr>
           <w:p>
-            <w:r>
-              <w:t>Dr. Alfred Ang</w:t>
-            </w:r>
+            <w:r/>
             <w:r>
               <w:rPr>
                 <w:sz w:val="19"/>
               </w:rPr>
+              <w:t>Dr. Alfred Ang</w:t>
+            </w:r>
+          </w:p>
+        </w:tc>
+      </w:tr>
+      <w:tr>
+        <w:tc>
+          <w:tcPr>
+            <w:tcW w:type="dxa" w:w="2160"/>
+          </w:tcPr>
+          <w:p>
+            <w:r/>
+            <w:r>
+              <w:rPr>
+                <w:sz w:val="19"/>
+              </w:rPr>
+              <w:t>2.5</w:t>
+            </w:r>
+          </w:p>
+        </w:tc>
+        <w:tc>
+          <w:tcPr>
+            <w:tcW w:type="dxa" w:w="2160"/>
+          </w:tcPr>
+          <w:p>
+            <w:r/>
+            <w:r>
+              <w:rPr>
+                <w:sz w:val="19"/>
+              </w:rPr>
+              <w:t>17 October 2026</w:t>
+            </w:r>
+          </w:p>
+        </w:tc>
+        <w:tc>
+          <w:tcPr>
+            <w:tcW w:type="dxa" w:w="2160"/>
+          </w:tcPr>
+          <w:p>
+            <w:r/>
+            <w:r>
+              <w:rPr>
+                <w:sz w:val="19"/>
+              </w:rPr>
+              <w:t>Updated from the parent course courseware v2.5: Topic 1 opens with the modern view of agentic automation (a brief history of AI, agentic AI vs AI agents, workflow first vs agent first, AI-assisted workflow creation with n8n Assistant, AI security); every lab now follows the concepts it needs; a Telegram HR chatbot demo before Lab 3; guardrails before Lab 4; real n8n screenshots explained for Labs 2–5. Assessment and funding content removed; both days 9:30am – 5:30pm (7.5 instructional hours/day) with a 30-minute lunch break; slide references remapped.</w:t>
+            </w:r>
+          </w:p>
+        </w:tc>
+        <w:tc>
+          <w:tcPr>
+            <w:tcW w:type="dxa" w:w="2160"/>
+          </w:tcPr>
+          <w:p>
+            <w:r/>
+            <w:r>
+              <w:rPr>
+                <w:sz w:val="19"/>
+              </w:rPr>
+              <w:t>Dr. Alfred Ang</w:t>
             </w:r>
           </w:p>
         </w:tc>
@@ -520,7 +570,7 @@
         </w:rPr>
         <w:t>Course Schedule</w:t>
         <w:tab/>
-        <w:t>5</w:t>
+        <w:t>4</w:t>
       </w:r>
     </w:p>
     <w:p>
@@ -539,6 +589,8 @@
           <w:sz w:val="21"/>
         </w:rPr>
         <w:t>Day 1 · 9:30am – 5:30pm — n8n, AI Agents and Agentic Chatbots</w:t>
+        <w:tab/>
+        <w:t>4</w:t>
       </w:r>
     </w:p>
     <w:p>
@@ -557,6 +609,8 @@
           <w:sz w:val="21"/>
         </w:rPr>
         <w:t>Day 2 · 9:30am – 5:30pm — Human in the Loop and RAG</w:t>
+        <w:tab/>
+        <w:t>6</w:t>
       </w:r>
     </w:p>
     <w:p>
@@ -624,13 +678,12 @@
             <w:tcW w:type="dxa" w:w="4320"/>
           </w:tcPr>
           <w:p>
-            <w:r>
-              <w:t>Automate Business Processes with Agentic AI Workflows</w:t>
-            </w:r>
+            <w:r/>
             <w:r>
               <w:rPr>
                 <w:sz w:val="20"/>
               </w:rPr>
+              <w:t>Automate Business Processes with Agentic AI Workflows</w:t>
             </w:r>
           </w:p>
         </w:tc>
@@ -642,14 +695,13 @@
             <w:shd w:val="clear" w:color="auto" w:fill="E8F0FE"/>
           </w:tcPr>
           <w:p>
-            <w:r>
-              <w:t>Course Code</w:t>
-            </w:r>
+            <w:r/>
             <w:r>
               <w:rPr>
                 <w:b/>
                 <w:sz w:val="20"/>
               </w:rPr>
+              <w:t>Course Code</w:t>
             </w:r>
           </w:p>
         </w:tc>
@@ -658,13 +710,12 @@
             <w:tcW w:type="dxa" w:w="4320"/>
           </w:tcPr>
           <w:p>
-            <w:r>
-              <w:t>C209</w:t>
-            </w:r>
+            <w:r/>
             <w:r>
               <w:rPr>
                 <w:sz w:val="20"/>
               </w:rPr>
+              <w:t>C209</w:t>
             </w:r>
           </w:p>
         </w:tc>
@@ -676,14 +727,13 @@
             <w:shd w:val="clear" w:color="auto" w:fill="E8F0FE"/>
           </w:tcPr>
           <w:p>
-            <w:r>
-              <w:t>Course Type</w:t>
-            </w:r>
+            <w:r/>
             <w:r>
               <w:rPr>
                 <w:b/>
                 <w:sz w:val="20"/>
               </w:rPr>
+              <w:t>Course Type</w:t>
             </w:r>
           </w:p>
         </w:tc>
@@ -692,13 +742,12 @@
             <w:tcW w:type="dxa" w:w="4320"/>
           </w:tcPr>
           <w:p>
-            <w:r>
-              <w:t>Non-WSQ commercial short course</w:t>
-            </w:r>
+            <w:r/>
             <w:r>
               <w:rPr>
                 <w:sz w:val="20"/>
               </w:rPr>
+              <w:t>Non-WSQ commercial short course</w:t>
             </w:r>
           </w:p>
         </w:tc>
@@ -757,13 +806,12 @@
             <w:tcW w:type="dxa" w:w="4320"/>
           </w:tcPr>
           <w:p>
-            <w:r>
-              <w:t>2 days · 7.5 instructional hours per day (15 hours)</w:t>
-            </w:r>
+            <w:r/>
             <w:r>
               <w:rPr>
                 <w:sz w:val="20"/>
               </w:rPr>
+              <w:t>2 days · 7.5 instructional hours per day (15 hours)</w:t>
             </w:r>
           </w:p>
         </w:tc>
@@ -790,13 +838,12 @@
             <w:tcW w:type="dxa" w:w="4320"/>
           </w:tcPr>
           <w:p>
-            <w:r>
-              <w:t>Day 1: 9:30 am – 5:30 pm.  Day 2: 9:30 am – 5:30 pm.  A 30-minute lunch break each day is excluded from instructional time.</w:t>
-            </w:r>
+            <w:r/>
             <w:r>
               <w:rPr>
                 <w:sz w:val="20"/>
               </w:rPr>
+              <w:t>Day 1: 9:30 am – 5:30 pm.  Day 2: 9:30 am – 5:30 pm.  A 30-minute lunch break each day is excluded from instructional time.</w:t>
             </w:r>
           </w:p>
         </w:tc>
@@ -935,9 +982,6 @@
       </w:r>
     </w:p>
     <w:p>
-      <w:r/>
-    </w:p>
-    <w:p>
       <w:pPr>
         <w:pStyle w:val="Heading1"/>
       </w:pPr>
@@ -1028,15 +1072,14 @@
             <w:shd w:val="clear" w:color="auto" w:fill="F3F5F8"/>
           </w:tcPr>
           <w:p>
-            <w:r>
-              <w:t>9:30–10:00</w:t>
-            </w:r>
+            <w:r/>
             <w:r>
               <w:rPr>
                 <w:rFonts w:ascii="Arial" w:hAnsi="Arial"/>
                 <w:b w:val="0"/>
                 <w:sz w:val="19"/>
               </w:rPr>
+              <w:t>9:30–10:00</w:t>
             </w:r>
           </w:p>
         </w:tc>
@@ -1046,15 +1089,14 @@
             <w:shd w:val="clear" w:color="auto" w:fill="F3F5F8"/>
           </w:tcPr>
           <w:p>
-            <w:r>
-              <w:t>30 min</w:t>
-            </w:r>
+            <w:r/>
             <w:r>
               <w:rPr>
                 <w:rFonts w:ascii="Arial" w:hAnsi="Arial"/>
                 <w:b w:val="0"/>
                 <w:sz w:val="19"/>
               </w:rPr>
+              <w:t>30 min</w:t>
             </w:r>
           </w:p>
         </w:tc>
@@ -1064,15 +1106,14 @@
             <w:shd w:val="clear" w:color="auto" w:fill="F3F5F8"/>
           </w:tcPr>
           <w:p>
-            <w:r>
-              <w:t>Welcome, trainer and learner introductions, ground rules, course outline and learning outcomes. Slides 2–12</w:t>
-            </w:r>
+            <w:r/>
             <w:r>
               <w:rPr>
                 <w:rFonts w:ascii="Arial" w:hAnsi="Arial"/>
                 <w:b w:val="0"/>
                 <w:sz w:val="19"/>
               </w:rPr>
+              <w:t>Welcome, trainer and learner introductions, ground rules, course portal and workflows, course outline and learning outcomes. Slides 2–11</w:t>
             </w:r>
           </w:p>
         </w:tc>
@@ -1084,15 +1125,14 @@
             <w:shd w:val="clear" w:color="auto" w:fill="E8F0FE"/>
           </w:tcPr>
           <w:p>
-            <w:r>
-              <w:t>10:00–11:00</w:t>
-            </w:r>
+            <w:r/>
             <w:r>
               <w:rPr>
                 <w:rFonts w:ascii="Arial" w:hAnsi="Arial"/>
                 <w:b/>
                 <w:sz w:val="19"/>
               </w:rPr>
+              <w:t>10:00–11:00</w:t>
             </w:r>
           </w:p>
         </w:tc>
@@ -1102,15 +1142,14 @@
             <w:shd w:val="clear" w:color="auto" w:fill="E8F0FE"/>
           </w:tcPr>
           <w:p>
-            <w:r>
-              <w:t>60 min</w:t>
-            </w:r>
+            <w:r/>
             <w:r>
               <w:rPr>
                 <w:rFonts w:ascii="Arial" w:hAnsi="Arial"/>
                 <w:b w:val="0"/>
                 <w:sz w:val="19"/>
               </w:rPr>
+              <w:t>60 min</w:t>
             </w:r>
           </w:p>
         </w:tc>
@@ -1120,71 +1159,14 @@
             <w:shd w:val="clear" w:color="auto" w:fill="E8F0FE"/>
           </w:tcPr>
           <w:p>
-            <w:r>
-              <w:t>Foundation — Why agentic AI: the evolution of AI, agentic vs generative AI, from RPA to Agentic Process Automation, business value and use cases. Slides 13–19</w:t>
-            </w:r>
+            <w:r/>
             <w:r>
               <w:rPr>
                 <w:rFonts w:ascii="Arial" w:hAnsi="Arial"/>
                 <w:b/>
                 <w:sz w:val="19"/>
               </w:rPr>
-            </w:r>
-          </w:p>
-        </w:tc>
-      </w:tr>
-      <w:tr>
-        <w:tc>
-          <w:tcPr>
-            <w:tcW w:type="dxa" w:w="1440"/>
-            <w:shd w:val="clear" w:color="auto" w:fill="FFF4E5"/>
-          </w:tcPr>
-          <w:p>
-            <w:r>
-              <w:t>11:00–12:15</w:t>
-            </w:r>
-            <w:r>
-              <w:rPr>
-                <w:rFonts w:ascii="Arial" w:hAnsi="Arial"/>
-                <w:b w:val="0"/>
-                <w:sz w:val="19"/>
-              </w:rPr>
-            </w:r>
-          </w:p>
-        </w:tc>
-        <w:tc>
-          <w:tcPr>
-            <w:tcW w:type="dxa" w:w="1152"/>
-            <w:shd w:val="clear" w:color="auto" w:fill="FFF4E5"/>
-          </w:tcPr>
-          <w:p>
-            <w:r>
-              <w:t>75 min</w:t>
-            </w:r>
-            <w:r>
-              <w:rPr>
-                <w:rFonts w:ascii="Arial" w:hAnsi="Arial"/>
-                <w:b w:val="0"/>
-                <w:sz w:val="19"/>
-              </w:rPr>
-            </w:r>
-          </w:p>
-        </w:tc>
-        <w:tc>
-          <w:tcPr>
-            <w:tcW w:type="dxa" w:w="7056"/>
-            <w:shd w:val="clear" w:color="auto" w:fill="FFF4E5"/>
-          </w:tcPr>
-          <w:p>
-            <w:r>
-              <w:t>Topic 1 — Overview of n8n and AI Agents: what n8n is, hosting options, credentials, node types, trigger nodes, data-processing nodes, JSON and expressions, execution modes. Slides 20–32</w:t>
-            </w:r>
-            <w:r>
-              <w:rPr>
-                <w:rFonts w:ascii="Arial" w:hAnsi="Arial"/>
-                <w:b w:val="0"/>
-                <w:sz w:val="19"/>
-              </w:rPr>
+              <w:t>Topic 1 — Overview of n8n and AI Agents: why agentic AI, and why workflow first — a brief history of AI 2023–2026, generative AI vs agentic AI, agentic AI vs AI agents, workflow first vs agent first, AI-assisted workflow creation, platform tiers (no-code, AI-assisted low-code, AI-generated full-code), business value, use cases, the five principles of AI security, what n8n is, signing in to n8n, and a demo that builds a social media campaign workflow with n8n Assistant. Slides 12–28</w:t>
             </w:r>
           </w:p>
         </w:tc>
@@ -1196,15 +1178,14 @@
             <w:shd w:val="clear" w:color="auto" w:fill="E8F0FE"/>
           </w:tcPr>
           <w:p>
-            <w:r>
-              <w:t>12:15–12:45</w:t>
-            </w:r>
+            <w:r/>
             <w:r>
               <w:rPr>
                 <w:rFonts w:ascii="Arial" w:hAnsi="Arial"/>
                 <w:b/>
                 <w:sz w:val="19"/>
               </w:rPr>
+              <w:t>11:00–11:30</w:t>
             </w:r>
           </w:p>
         </w:tc>
@@ -1214,15 +1195,14 @@
             <w:shd w:val="clear" w:color="auto" w:fill="E8F0FE"/>
           </w:tcPr>
           <w:p>
-            <w:r>
-              <w:t>30 min</w:t>
-            </w:r>
+            <w:r/>
             <w:r>
               <w:rPr>
                 <w:rFonts w:ascii="Arial" w:hAnsi="Arial"/>
                 <w:b w:val="0"/>
                 <w:sz w:val="19"/>
               </w:rPr>
+              <w:t>30 min</w:t>
             </w:r>
           </w:p>
         </w:tc>
@@ -1232,15 +1212,64 @@
             <w:shd w:val="clear" w:color="auto" w:fill="E8F0FE"/>
           </w:tcPr>
           <w:p>
-            <w:r>
-              <w:t>Lunch break</w:t>
-            </w:r>
+            <w:r/>
             <w:r>
               <w:rPr>
                 <w:rFonts w:ascii="Arial" w:hAnsi="Arial"/>
                 <w:b/>
                 <w:sz w:val="19"/>
               </w:rPr>
+              <w:t>Topic 1 (continued) — n8n fundamentals: trigger nodes, data-processing nodes, storage and app actions, JSON and expressions, test vs production executions, and credentials. Slides 29–38</w:t>
+            </w:r>
+          </w:p>
+        </w:tc>
+      </w:tr>
+      <w:tr>
+        <w:tc>
+          <w:tcPr>
+            <w:tcW w:type="dxa" w:w="1440"/>
+          </w:tcPr>
+          <w:p>
+            <w:r/>
+            <w:r>
+              <w:rPr>
+                <w:rFonts w:ascii="Arial" w:hAnsi="Arial"/>
+                <w:b w:val="0"/>
+                <w:sz w:val="19"/>
+              </w:rPr>
+              <w:t>11:30–12:15</w:t>
+            </w:r>
+          </w:p>
+        </w:tc>
+        <w:tc>
+          <w:tcPr>
+            <w:tcW w:type="dxa" w:w="1152"/>
+          </w:tcPr>
+          <w:p>
+            <w:r/>
+            <w:r>
+              <w:rPr>
+                <w:rFonts w:ascii="Arial" w:hAnsi="Arial"/>
+                <w:b w:val="0"/>
+                <w:sz w:val="19"/>
+              </w:rPr>
+              <w:t>45 min</w:t>
+            </w:r>
+          </w:p>
+        </w:tc>
+        <w:tc>
+          <w:tcPr>
+            <w:tcW w:type="dxa" w:w="7056"/>
+          </w:tcPr>
+          <w:p>
+            <w:r/>
+            <w:r>
+              <w:rPr>
+                <w:rFonts w:ascii="Arial" w:hAnsi="Arial"/>
+                <w:b w:val="0"/>
+                <w:sz w:val="19"/>
+              </w:rPr>
+              <w:t>Hands-on Lab 1 — n8n Trigger and Action (Event Flyer with QR Code): build the form-to-Gmail workflow, publish it, copy the form's Production URL and create a QR-code event flyer; present and scan-test the flyers. Slides 39–47</w:t>
             </w:r>
           </w:p>
         </w:tc>
@@ -1252,15 +1281,14 @@
             <w:shd w:val="clear" w:color="auto" w:fill="FDE9D9"/>
           </w:tcPr>
           <w:p>
-            <w:r>
-              <w:t>12:45–14:00</w:t>
-            </w:r>
+            <w:r/>
             <w:r>
               <w:rPr>
                 <w:rFonts w:ascii="Arial" w:hAnsi="Arial"/>
                 <w:b w:val="0"/>
                 <w:sz w:val="19"/>
               </w:rPr>
+              <w:t>12:15–12:45</w:t>
             </w:r>
           </w:p>
         </w:tc>
@@ -1270,15 +1298,14 @@
             <w:shd w:val="clear" w:color="auto" w:fill="FDE9D9"/>
           </w:tcPr>
           <w:p>
-            <w:r>
-              <w:t>75 min</w:t>
-            </w:r>
+            <w:r/>
             <w:r>
               <w:rPr>
                 <w:rFonts w:ascii="Arial" w:hAnsi="Arial"/>
                 <w:b w:val="0"/>
                 <w:sz w:val="19"/>
               </w:rPr>
+              <w:t>30 min</w:t>
             </w:r>
           </w:p>
         </w:tc>
@@ -1288,15 +1315,14 @@
             <w:shd w:val="clear" w:color="auto" w:fill="FDE9D9"/>
           </w:tcPr>
           <w:p>
-            <w:r>
-              <w:t>Topic 1 (continued) — AI agents: the four components (model, memory, tools, instructions), popular LLM providers, model parameters and temperature, instruction design with worked examples, and MCP. Slides 33–42</w:t>
-            </w:r>
+            <w:r/>
             <w:r>
               <w:rPr>
                 <w:rFonts w:ascii="Arial" w:hAnsi="Arial"/>
                 <w:b w:val="0"/>
                 <w:sz w:val="19"/>
               </w:rPr>
+              <w:t>Lunch break</w:t>
             </w:r>
           </w:p>
         </w:tc>
@@ -1308,15 +1334,14 @@
             <w:shd w:val="clear" w:color="auto" w:fill="E8F0FE"/>
           </w:tcPr>
           <w:p>
-            <w:r>
-              <w:t>14:00–15:00</w:t>
-            </w:r>
+            <w:r/>
             <w:r>
               <w:rPr>
                 <w:rFonts w:ascii="Arial" w:hAnsi="Arial"/>
                 <w:b/>
                 <w:sz w:val="19"/>
               </w:rPr>
+              <w:t>12:45–14:30</w:t>
             </w:r>
           </w:p>
         </w:tc>
@@ -1326,15 +1351,14 @@
             <w:shd w:val="clear" w:color="auto" w:fill="E8F0FE"/>
           </w:tcPr>
           <w:p>
-            <w:r>
-              <w:t>60 min</w:t>
-            </w:r>
+            <w:r/>
             <w:r>
               <w:rPr>
                 <w:rFonts w:ascii="Arial" w:hAnsi="Arial"/>
                 <w:b w:val="0"/>
                 <w:sz w:val="19"/>
               </w:rPr>
+              <w:t>105 min</w:t>
             </w:r>
           </w:p>
         </w:tc>
@@ -1344,15 +1368,14 @@
             <w:shd w:val="clear" w:color="auto" w:fill="E8F0FE"/>
           </w:tcPr>
           <w:p>
-            <w:r>
-              <w:t>Topic 1 (continued) — Webhooks: the inbound URL, webhook vs HTTP Request, GET vs POST, Test vs Production URL, webhook configuration and structured output. Slides 43–50</w:t>
-            </w:r>
+            <w:r/>
             <w:r>
               <w:rPr>
                 <w:rFonts w:ascii="Arial" w:hAnsi="Arial"/>
                 <w:b/>
                 <w:sz w:val="19"/>
               </w:rPr>
+              <w:t>Topic 1 (continued) — The building blocks of an AI agent, before Lab 2: the AI agent and its loop, the model (popular LLM providers, model parameters and temperature, claiming the free AI credits), tools and MCP, instructions with worked examples, memory, and structured output. Slides 49–61</w:t>
             </w:r>
           </w:p>
         </w:tc>
@@ -1364,15 +1387,14 @@
             <w:shd w:val="clear" w:color="auto" w:fill="E8F0FE"/>
           </w:tcPr>
           <w:p>
-            <w:r>
-              <w:t>15:00–16:00</w:t>
-            </w:r>
+            <w:r/>
             <w:r>
               <w:rPr>
                 <w:rFonts w:ascii="Arial" w:hAnsi="Arial"/>
                 <w:b/>
                 <w:sz w:val="19"/>
               </w:rPr>
+              <w:t>14:30–15:15</w:t>
             </w:r>
           </w:p>
         </w:tc>
@@ -1382,15 +1404,14 @@
             <w:shd w:val="clear" w:color="auto" w:fill="E8F0FE"/>
           </w:tcPr>
           <w:p>
-            <w:r>
-              <w:t>60 min</w:t>
-            </w:r>
+            <w:r/>
             <w:r>
               <w:rPr>
                 <w:rFonts w:ascii="Arial" w:hAnsi="Arial"/>
                 <w:b w:val="0"/>
                 <w:sz w:val="19"/>
               </w:rPr>
+              <w:t>45 min</w:t>
             </w:r>
           </w:p>
         </w:tc>
@@ -1400,71 +1421,14 @@
             <w:shd w:val="clear" w:color="auto" w:fill="E8F0FE"/>
           </w:tcPr>
           <w:p>
-            <w:r>
-              <w:t>Hands-on Lab 1 — n8n Trigger and Action (Event Flyer with QR Code). Slides 51–54</w:t>
-            </w:r>
+            <w:r/>
             <w:r>
               <w:rPr>
                 <w:rFonts w:ascii="Arial" w:hAnsi="Arial"/>
                 <w:b/>
                 <w:sz w:val="19"/>
               </w:rPr>
-            </w:r>
-          </w:p>
-        </w:tc>
-      </w:tr>
-      <w:tr>
-        <w:tc>
-          <w:tcPr>
-            <w:tcW w:type="dxa" w:w="1440"/>
-            <w:shd w:val="clear" w:color="auto" w:fill="FFF4E5"/>
-          </w:tcPr>
-          <w:p>
-            <w:r>
-              <w:t>16:00–17:15</w:t>
-            </w:r>
-            <w:r>
-              <w:rPr>
-                <w:rFonts w:ascii="Arial" w:hAnsi="Arial"/>
-                <w:b w:val="0"/>
-                <w:sz w:val="19"/>
-              </w:rPr>
-            </w:r>
-          </w:p>
-        </w:tc>
-        <w:tc>
-          <w:tcPr>
-            <w:tcW w:type="dxa" w:w="1152"/>
-            <w:shd w:val="clear" w:color="auto" w:fill="FFF4E5"/>
-          </w:tcPr>
-          <w:p>
-            <w:r>
-              <w:t>75 min</w:t>
-            </w:r>
-            <w:r>
-              <w:rPr>
-                <w:rFonts w:ascii="Arial" w:hAnsi="Arial"/>
-                <w:b w:val="0"/>
-                <w:sz w:val="19"/>
-              </w:rPr>
-            </w:r>
-          </w:p>
-        </w:tc>
-        <w:tc>
-          <w:tcPr>
-            <w:tcW w:type="dxa" w:w="7056"/>
-            <w:shd w:val="clear" w:color="auto" w:fill="FFF4E5"/>
-          </w:tcPr>
-          <w:p>
-            <w:r>
-              <w:t>Hands-on Lab 2 — Webhook and AI Agent (Marina Trust Bank Onboarding). Slides 55–57</w:t>
-            </w:r>
-            <w:r>
-              <w:rPr>
-                <w:rFonts w:ascii="Arial" w:hAnsi="Arial"/>
-                <w:b w:val="0"/>
-                <w:sz w:val="19"/>
-              </w:rPr>
+              <w:t>Topic 1 (continued) — Webhooks: the inbound URL, webhook vs HTTP Request, GET vs POST, Test vs Production URL and webhook configuration. Slides 62–69</w:t>
             </w:r>
           </w:p>
         </w:tc>
@@ -1475,15 +1439,14 @@
             <w:tcW w:type="dxa" w:w="1440"/>
           </w:tcPr>
           <w:p>
-            <w:r>
-              <w:t>17:15–17:30</w:t>
-            </w:r>
+            <w:r/>
             <w:r>
               <w:rPr>
                 <w:rFonts w:ascii="Arial" w:hAnsi="Arial"/>
                 <w:b w:val="0"/>
                 <w:sz w:val="19"/>
               </w:rPr>
+              <w:t>15:15–17:15</w:t>
             </w:r>
           </w:p>
         </w:tc>
@@ -1492,15 +1455,14 @@
             <w:tcW w:type="dxa" w:w="1152"/>
           </w:tcPr>
           <w:p>
-            <w:r>
-              <w:t>15 min</w:t>
-            </w:r>
+            <w:r/>
             <w:r>
               <w:rPr>
                 <w:rFonts w:ascii="Arial" w:hAnsi="Arial"/>
                 <w:b w:val="0"/>
                 <w:sz w:val="19"/>
               </w:rPr>
+              <w:t>120 min</w:t>
             </w:r>
           </w:p>
         </w:tc>
@@ -1509,15 +1471,67 @@
             <w:tcW w:type="dxa" w:w="7056"/>
           </w:tcPr>
           <w:p>
-            <w:r>
-              <w:t>Day 1 recap and Q&amp;A</w:t>
-            </w:r>
+            <w:r/>
             <w:r>
               <w:rPr>
                 <w:rFonts w:ascii="Arial" w:hAnsi="Arial"/>
                 <w:b w:val="0"/>
                 <w:sz w:val="19"/>
               </w:rPr>
+              <w:t>Hands-on Lab 2 — Webhook and AI Agent (Marina Trust Bank Onboarding): how the webhook, agent, model, tools, instructions, memory and structured output fit together, then build and test the onboarding agent. Slides 70–74</w:t>
+            </w:r>
+          </w:p>
+        </w:tc>
+      </w:tr>
+      <w:tr>
+        <w:tc>
+          <w:tcPr>
+            <w:tcW w:type="dxa" w:w="1440"/>
+            <w:shd w:val="clear" w:color="auto" w:fill="F3F5F8"/>
+          </w:tcPr>
+          <w:p>
+            <w:r/>
+            <w:r>
+              <w:rPr>
+                <w:rFonts w:ascii="Arial" w:hAnsi="Arial"/>
+                <w:b w:val="0"/>
+                <w:sz w:val="19"/>
+              </w:rPr>
+              <w:t>17:15–17:30</w:t>
+            </w:r>
+          </w:p>
+        </w:tc>
+        <w:tc>
+          <w:tcPr>
+            <w:tcW w:type="dxa" w:w="1152"/>
+            <w:shd w:val="clear" w:color="auto" w:fill="F3F5F8"/>
+          </w:tcPr>
+          <w:p>
+            <w:r/>
+            <w:r>
+              <w:rPr>
+                <w:rFonts w:ascii="Arial" w:hAnsi="Arial"/>
+                <w:b w:val="0"/>
+                <w:sz w:val="19"/>
+              </w:rPr>
+              <w:t>15 min</w:t>
+            </w:r>
+          </w:p>
+        </w:tc>
+        <w:tc>
+          <w:tcPr>
+            <w:tcW w:type="dxa" w:w="7056"/>
+            <w:shd w:val="clear" w:color="auto" w:fill="F3F5F8"/>
+          </w:tcPr>
+          <w:p>
+            <w:r/>
+            <w:r>
+              <w:rPr>
+                <w:rFonts w:ascii="Arial" w:hAnsi="Arial"/>
+                <w:b w:val="0"/>
+                <w:sz w:val="19"/>
+              </w:rPr>
+              <w:t>Day 1 recap and Q&amp;A</w:t>
             </w:r>
           </w:p>
         </w:tc>
@@ -1530,7 +1544,7 @@
           <w:color w:val="555B66"/>
           <w:sz w:val="19"/>
         </w:rPr>
-        <w:t>Day total: 7.5 instructional hours (9:30am – 5:30pm).  The 30-minute lunch break is excluded from instructional time.</w:t>
+        <w:t>Instructional time: 450 minutes (7.5 hours).  The day runs 9:30 am – 5:30 pm: the 30-minute lunch break is excluded from instructional time.</w:t>
       </w:r>
     </w:p>
     <w:p>
@@ -1616,15 +1630,14 @@
             <w:shd w:val="clear" w:color="auto" w:fill="F3F5F8"/>
           </w:tcPr>
           <w:p>
-            <w:r>
-              <w:t>9:30–9:45</w:t>
-            </w:r>
+            <w:r/>
             <w:r>
               <w:rPr>
                 <w:rFonts w:ascii="Arial" w:hAnsi="Arial"/>
                 <w:b w:val="0"/>
                 <w:sz w:val="19"/>
               </w:rPr>
+              <w:t>9:30–9:45</w:t>
             </w:r>
           </w:p>
         </w:tc>
@@ -1634,15 +1647,14 @@
             <w:shd w:val="clear" w:color="auto" w:fill="F3F5F8"/>
           </w:tcPr>
           <w:p>
-            <w:r>
-              <w:t>15 min</w:t>
-            </w:r>
+            <w:r/>
             <w:r>
               <w:rPr>
                 <w:rFonts w:ascii="Arial" w:hAnsi="Arial"/>
                 <w:b w:val="0"/>
                 <w:sz w:val="19"/>
               </w:rPr>
+              <w:t>15 min</w:t>
             </w:r>
           </w:p>
         </w:tc>
@@ -1652,15 +1664,14 @@
             <w:shd w:val="clear" w:color="auto" w:fill="F3F5F8"/>
           </w:tcPr>
           <w:p>
-            <w:r>
-              <w:t>Day 1 recap and Q&amp;A</w:t>
-            </w:r>
+            <w:r/>
             <w:r>
               <w:rPr>
                 <w:rFonts w:ascii="Arial" w:hAnsi="Arial"/>
                 <w:b w:val="0"/>
                 <w:sz w:val="19"/>
               </w:rPr>
+              <w:t>Day 1 recap</w:t>
             </w:r>
           </w:p>
         </w:tc>
@@ -1672,15 +1683,14 @@
             <w:shd w:val="clear" w:color="auto" w:fill="E8F0FE"/>
           </w:tcPr>
           <w:p>
-            <w:r>
-              <w:t>9:45–11:00</w:t>
-            </w:r>
+            <w:r/>
             <w:r>
               <w:rPr>
                 <w:rFonts w:ascii="Arial" w:hAnsi="Arial"/>
                 <w:b/>
                 <w:sz w:val="19"/>
               </w:rPr>
+              <w:t>9:45–10:30</w:t>
             </w:r>
           </w:p>
         </w:tc>
@@ -1690,15 +1700,14 @@
             <w:shd w:val="clear" w:color="auto" w:fill="E8F0FE"/>
           </w:tcPr>
           <w:p>
-            <w:r>
-              <w:t>75 min</w:t>
-            </w:r>
+            <w:r/>
             <w:r>
               <w:rPr>
                 <w:rFonts w:ascii="Arial" w:hAnsi="Arial"/>
                 <w:b w:val="0"/>
                 <w:sz w:val="19"/>
               </w:rPr>
+              <w:t>45 min</w:t>
             </w:r>
           </w:p>
         </w:tc>
@@ -1708,71 +1717,14 @@
             <w:shd w:val="clear" w:color="auto" w:fill="E8F0FE"/>
           </w:tcPr>
           <w:p>
-            <w:r>
-              <w:t>Topic 2 — Agentic Chatbot and Human in the Loop: human in, on and out of the loop; how an approval suspends a running workflow; when a human belongs in the workflow; and guardrails. Slides 59–63</w:t>
-            </w:r>
+            <w:r/>
             <w:r>
               <w:rPr>
                 <w:rFonts w:ascii="Arial" w:hAnsi="Arial"/>
                 <w:b/>
                 <w:sz w:val="19"/>
               </w:rPr>
-            </w:r>
-          </w:p>
-        </w:tc>
-      </w:tr>
-      <w:tr>
-        <w:tc>
-          <w:tcPr>
-            <w:tcW w:type="dxa" w:w="1440"/>
-            <w:shd w:val="clear" w:color="auto" w:fill="FFF4E5"/>
-          </w:tcPr>
-          <w:p>
-            <w:r>
-              <w:t>11:00–12:15</w:t>
-            </w:r>
-            <w:r>
-              <w:rPr>
-                <w:rFonts w:ascii="Arial" w:hAnsi="Arial"/>
-                <w:b w:val="0"/>
-                <w:sz w:val="19"/>
-              </w:rPr>
-            </w:r>
-          </w:p>
-        </w:tc>
-        <w:tc>
-          <w:tcPr>
-            <w:tcW w:type="dxa" w:w="1152"/>
-            <w:shd w:val="clear" w:color="auto" w:fill="FFF4E5"/>
-          </w:tcPr>
-          <w:p>
-            <w:r>
-              <w:t>75 min</w:t>
-            </w:r>
-            <w:r>
-              <w:rPr>
-                <w:rFonts w:ascii="Arial" w:hAnsi="Arial"/>
-                <w:b w:val="0"/>
-                <w:sz w:val="19"/>
-              </w:rPr>
-            </w:r>
-          </w:p>
-        </w:tc>
-        <w:tc>
-          <w:tcPr>
-            <w:tcW w:type="dxa" w:w="7056"/>
-            <w:shd w:val="clear" w:color="auto" w:fill="FFF4E5"/>
-          </w:tcPr>
-          <w:p>
-            <w:r>
-              <w:t>Hands-on Lab 3 — Chatbot Webhook (Investment Advisor): the contact gate and the four compliance probes. Slides 64–66</w:t>
-            </w:r>
-            <w:r>
-              <w:rPr>
-                <w:rFonts w:ascii="Arial" w:hAnsi="Arial"/>
-                <w:b w:val="0"/>
-                <w:sz w:val="19"/>
-              </w:rPr>
+              <w:t>Topic 2 — Agentic Chatbot and Human in the Loop, before Lab 3: rule-based vs agentic workflows, designing a safe agentic chatbot, and a chatbot demo on Telegram — learners create a bot with BotFather /newbot, build an HR policy chatbot with n8n Assistant from one prompt, then connect, publish and chat with it. Slides 75–84</w:t>
             </w:r>
           </w:p>
         </w:tc>
@@ -1783,15 +1735,14 @@
             <w:tcW w:type="dxa" w:w="1440"/>
           </w:tcPr>
           <w:p>
-            <w:r>
-              <w:t>12:15–12:45</w:t>
-            </w:r>
+            <w:r/>
             <w:r>
               <w:rPr>
                 <w:rFonts w:ascii="Arial" w:hAnsi="Arial"/>
                 <w:b w:val="0"/>
                 <w:sz w:val="19"/>
               </w:rPr>
+              <w:t>10:30–11:00</w:t>
             </w:r>
           </w:p>
         </w:tc>
@@ -1800,15 +1751,14 @@
             <w:tcW w:type="dxa" w:w="1152"/>
           </w:tcPr>
           <w:p>
-            <w:r>
-              <w:t>30 min</w:t>
-            </w:r>
+            <w:r/>
             <w:r>
               <w:rPr>
                 <w:rFonts w:ascii="Arial" w:hAnsi="Arial"/>
                 <w:b w:val="0"/>
                 <w:sz w:val="19"/>
               </w:rPr>
+              <w:t>30 min</w:t>
             </w:r>
           </w:p>
         </w:tc>
@@ -1817,15 +1767,117 @@
             <w:tcW w:type="dxa" w:w="7056"/>
           </w:tcPr>
           <w:p>
-            <w:r>
-              <w:t>Lunch break</w:t>
-            </w:r>
+            <w:r/>
             <w:r>
               <w:rPr>
                 <w:rFonts w:ascii="Arial" w:hAnsi="Arial"/>
                 <w:b w:val="0"/>
                 <w:sz w:val="19"/>
               </w:rPr>
+              <w:t>Hands-on Lab 3 — Chatbot Webhook (Investment Advisor): import the workflow, read the contact gate, the non-advisory rule and the FAQ, and deploy the chatbot behind the website. Slides 85–88</w:t>
+            </w:r>
+          </w:p>
+        </w:tc>
+      </w:tr>
+      <w:tr>
+        <w:tc>
+          <w:tcPr>
+            <w:tcW w:type="dxa" w:w="1440"/>
+          </w:tcPr>
+          <w:p>
+            <w:r/>
+            <w:r>
+              <w:rPr>
+                <w:rFonts w:ascii="Arial" w:hAnsi="Arial"/>
+                <w:b w:val="0"/>
+                <w:sz w:val="19"/>
+              </w:rPr>
+              <w:t>11:00–11:30</w:t>
+            </w:r>
+          </w:p>
+        </w:tc>
+        <w:tc>
+          <w:tcPr>
+            <w:tcW w:type="dxa" w:w="1152"/>
+          </w:tcPr>
+          <w:p>
+            <w:r/>
+            <w:r>
+              <w:rPr>
+                <w:rFonts w:ascii="Arial" w:hAnsi="Arial"/>
+                <w:b w:val="0"/>
+                <w:sz w:val="19"/>
+              </w:rPr>
+              <w:t>30 min</w:t>
+            </w:r>
+          </w:p>
+        </w:tc>
+        <w:tc>
+          <w:tcPr>
+            <w:tcW w:type="dxa" w:w="7056"/>
+          </w:tcPr>
+          <w:p>
+            <w:r/>
+            <w:r>
+              <w:rPr>
+                <w:rFonts w:ascii="Arial" w:hAnsi="Arial"/>
+                <w:b w:val="0"/>
+                <w:sz w:val="19"/>
+              </w:rPr>
+              <w:t>Hands-on Lab 3 — Chatbot Webhook (continued): test the contact gate and the four compliance probes, and debrief.</w:t>
+            </w:r>
+          </w:p>
+        </w:tc>
+      </w:tr>
+      <w:tr>
+        <w:tc>
+          <w:tcPr>
+            <w:tcW w:type="dxa" w:w="1440"/>
+            <w:shd w:val="clear" w:color="auto" w:fill="E8F0FE"/>
+          </w:tcPr>
+          <w:p>
+            <w:r/>
+            <w:r>
+              <w:rPr>
+                <w:rFonts w:ascii="Arial" w:hAnsi="Arial"/>
+                <w:b/>
+                <w:sz w:val="19"/>
+              </w:rPr>
+              <w:t>11:30–12:15</w:t>
+            </w:r>
+          </w:p>
+        </w:tc>
+        <w:tc>
+          <w:tcPr>
+            <w:tcW w:type="dxa" w:w="1152"/>
+            <w:shd w:val="clear" w:color="auto" w:fill="E8F0FE"/>
+          </w:tcPr>
+          <w:p>
+            <w:r/>
+            <w:r>
+              <w:rPr>
+                <w:rFonts w:ascii="Arial" w:hAnsi="Arial"/>
+                <w:b w:val="0"/>
+                <w:sz w:val="19"/>
+              </w:rPr>
+              <w:t>45 min</w:t>
+            </w:r>
+          </w:p>
+        </w:tc>
+        <w:tc>
+          <w:tcPr>
+            <w:tcW w:type="dxa" w:w="7056"/>
+            <w:shd w:val="clear" w:color="auto" w:fill="E8F0FE"/>
+          </w:tcPr>
+          <w:p>
+            <w:r/>
+            <w:r>
+              <w:rPr>
+                <w:rFonts w:ascii="Arial" w:hAnsi="Arial"/>
+                <w:b/>
+                <w:sz w:val="19"/>
+              </w:rPr>
+              <w:t>Topic 2 (continued) — Human in the loop and guardrails, before Lab 4: human in, on and out of the loop; how an approval suspends a running workflow; when a human belongs in the workflow; and guardrails. Slides 89–93</w:t>
             </w:r>
           </w:p>
         </w:tc>
@@ -1837,15 +1889,14 @@
             <w:shd w:val="clear" w:color="auto" w:fill="FDE9D9"/>
           </w:tcPr>
           <w:p>
-            <w:r>
-              <w:t>12:45–14:15</w:t>
-            </w:r>
+            <w:r/>
             <w:r>
               <w:rPr>
                 <w:rFonts w:ascii="Arial" w:hAnsi="Arial"/>
                 <w:b w:val="0"/>
                 <w:sz w:val="19"/>
               </w:rPr>
+              <w:t>12:15–12:45</w:t>
             </w:r>
           </w:p>
         </w:tc>
@@ -1855,15 +1906,14 @@
             <w:shd w:val="clear" w:color="auto" w:fill="FDE9D9"/>
           </w:tcPr>
           <w:p>
-            <w:r>
-              <w:t>90 min</w:t>
-            </w:r>
+            <w:r/>
             <w:r>
               <w:rPr>
                 <w:rFonts w:ascii="Arial" w:hAnsi="Arial"/>
                 <w:b w:val="0"/>
                 <w:sz w:val="19"/>
               </w:rPr>
+              <w:t>30 min</w:t>
             </w:r>
           </w:p>
         </w:tc>
@@ -1873,15 +1923,14 @@
             <w:shd w:val="clear" w:color="auto" w:fill="FDE9D9"/>
           </w:tcPr>
           <w:p>
-            <w:r>
-              <w:t>Hands-on Lab 4 — Human in the Loop (Client Rapport Assistant): the approve and decline paths. Slides 67–69</w:t>
-            </w:r>
+            <w:r/>
             <w:r>
               <w:rPr>
                 <w:rFonts w:ascii="Arial" w:hAnsi="Arial"/>
                 <w:b w:val="0"/>
                 <w:sz w:val="19"/>
               </w:rPr>
+              <w:t>Lunch break</w:t>
             </w:r>
           </w:p>
         </w:tc>
@@ -1892,15 +1941,14 @@
             <w:tcW w:type="dxa" w:w="1440"/>
           </w:tcPr>
           <w:p>
-            <w:r>
-              <w:t>14:15–15:30</w:t>
-            </w:r>
+            <w:r/>
             <w:r>
               <w:rPr>
                 <w:rFonts w:ascii="Arial" w:hAnsi="Arial"/>
                 <w:b w:val="0"/>
                 <w:sz w:val="19"/>
               </w:rPr>
+              <w:t>12:45–14:15</w:t>
             </w:r>
           </w:p>
         </w:tc>
@@ -1909,15 +1957,14 @@
             <w:tcW w:type="dxa" w:w="1152"/>
           </w:tcPr>
           <w:p>
-            <w:r>
-              <w:t>75 min</w:t>
-            </w:r>
+            <w:r/>
             <w:r>
               <w:rPr>
                 <w:rFonts w:ascii="Arial" w:hAnsi="Arial"/>
                 <w:b w:val="0"/>
                 <w:sz w:val="19"/>
               </w:rPr>
+              <w:t>90 min</w:t>
             </w:r>
           </w:p>
         </w:tc>
@@ -1926,71 +1973,14 @@
             <w:tcW w:type="dxa" w:w="7056"/>
           </w:tcPr>
           <w:p>
-            <w:r>
-              <w:t>Topic 3 — Retrieval-Augmented Generation: why retrieval rather than a bigger prompt, the RAG pipeline, tokenization and embeddings, chunking, vector stores and grounding. Slides 71–79</w:t>
-            </w:r>
+            <w:r/>
             <w:r>
               <w:rPr>
                 <w:rFonts w:ascii="Arial" w:hAnsi="Arial"/>
                 <w:b w:val="0"/>
                 <w:sz w:val="19"/>
               </w:rPr>
-            </w:r>
-          </w:p>
-        </w:tc>
-      </w:tr>
-      <w:tr>
-        <w:tc>
-          <w:tcPr>
-            <w:tcW w:type="dxa" w:w="1440"/>
-            <w:shd w:val="clear" w:color="auto" w:fill="FFF4E5"/>
-          </w:tcPr>
-          <w:p>
-            <w:r>
-              <w:t>15:30–17:00</w:t>
-            </w:r>
-            <w:r>
-              <w:rPr>
-                <w:rFonts w:ascii="Arial" w:hAnsi="Arial"/>
-                <w:b w:val="0"/>
-                <w:sz w:val="19"/>
-              </w:rPr>
-            </w:r>
-          </w:p>
-        </w:tc>
-        <w:tc>
-          <w:tcPr>
-            <w:tcW w:type="dxa" w:w="1152"/>
-            <w:shd w:val="clear" w:color="auto" w:fill="FFF4E5"/>
-          </w:tcPr>
-          <w:p>
-            <w:r>
-              <w:t>90 min</w:t>
-            </w:r>
-            <w:r>
-              <w:rPr>
-                <w:rFonts w:ascii="Arial" w:hAnsi="Arial"/>
-                <w:b w:val="0"/>
-                <w:sz w:val="19"/>
-              </w:rPr>
-            </w:r>
-          </w:p>
-        </w:tc>
-        <w:tc>
-          <w:tcPr>
-            <w:tcW w:type="dxa" w:w="7056"/>
-            <w:shd w:val="clear" w:color="auto" w:fill="FFF4E5"/>
-          </w:tcPr>
-          <w:p>
-            <w:r>
-              <w:t>Hands-on Lab 5 — RAG Customer Care Chatbot (Cook &amp; Bake Academy): ingestion and the grounded chatbot. Slides 80–83</w:t>
-            </w:r>
-            <w:r>
-              <w:rPr>
-                <w:rFonts w:ascii="Arial" w:hAnsi="Arial"/>
-                <w:b w:val="0"/>
-                <w:sz w:val="19"/>
-              </w:rPr>
+              <w:t>Hands-on Lab 4 — Human in the Loop (Client Rapport Assistant): the approve and decline paths. Slides 94–98</w:t>
             </w:r>
           </w:p>
         </w:tc>
@@ -2002,15 +1992,14 @@
             <w:shd w:val="clear" w:color="auto" w:fill="E8F0FE"/>
           </w:tcPr>
           <w:p>
-            <w:r>
-              <w:t>17:00–17:30</w:t>
-            </w:r>
+            <w:r/>
             <w:r>
               <w:rPr>
                 <w:rFonts w:ascii="Arial" w:hAnsi="Arial"/>
                 <w:b/>
                 <w:sz w:val="19"/>
               </w:rPr>
+              <w:t>14:15–15:30</w:t>
             </w:r>
           </w:p>
         </w:tc>
@@ -2020,15 +2009,14 @@
             <w:shd w:val="clear" w:color="auto" w:fill="E8F0FE"/>
           </w:tcPr>
           <w:p>
-            <w:r>
-              <w:t>30 min</w:t>
-            </w:r>
+            <w:r/>
             <w:r>
               <w:rPr>
                 <w:rFonts w:ascii="Arial" w:hAnsi="Arial"/>
                 <w:b w:val="0"/>
                 <w:sz w:val="19"/>
               </w:rPr>
+              <w:t>75 min</w:t>
             </w:r>
           </w:p>
         </w:tc>
@@ -2038,15 +2026,117 @@
             <w:shd w:val="clear" w:color="auto" w:fill="E8F0FE"/>
           </w:tcPr>
           <w:p>
-            <w:r>
-              <w:t>Course recap, taking it back to work, Q&amp;A. Slides 84–86</w:t>
-            </w:r>
+            <w:r/>
             <w:r>
               <w:rPr>
                 <w:rFonts w:ascii="Arial" w:hAnsi="Arial"/>
                 <w:b/>
                 <w:sz w:val="19"/>
               </w:rPr>
+              <w:t>Topic 3 — Retrieval-Augmented Generation: why retrieval rather than a bigger prompt, the RAG pipeline, tokenization and embeddings, chunking, vector stores and grounding. Slides 99–107</w:t>
+            </w:r>
+          </w:p>
+        </w:tc>
+      </w:tr>
+      <w:tr>
+        <w:tc>
+          <w:tcPr>
+            <w:tcW w:type="dxa" w:w="1440"/>
+          </w:tcPr>
+          <w:p>
+            <w:r/>
+            <w:r>
+              <w:rPr>
+                <w:rFonts w:ascii="Arial" w:hAnsi="Arial"/>
+                <w:b w:val="0"/>
+                <w:sz w:val="19"/>
+              </w:rPr>
+              <w:t>15:30–17:00</w:t>
+            </w:r>
+          </w:p>
+        </w:tc>
+        <w:tc>
+          <w:tcPr>
+            <w:tcW w:type="dxa" w:w="1152"/>
+          </w:tcPr>
+          <w:p>
+            <w:r/>
+            <w:r>
+              <w:rPr>
+                <w:rFonts w:ascii="Arial" w:hAnsi="Arial"/>
+                <w:b w:val="0"/>
+                <w:sz w:val="19"/>
+              </w:rPr>
+              <w:t>90 min</w:t>
+            </w:r>
+          </w:p>
+        </w:tc>
+        <w:tc>
+          <w:tcPr>
+            <w:tcW w:type="dxa" w:w="7056"/>
+          </w:tcPr>
+          <w:p>
+            <w:r/>
+            <w:r>
+              <w:rPr>
+                <w:rFonts w:ascii="Arial" w:hAnsi="Arial"/>
+                <w:b w:val="0"/>
+                <w:sz w:val="19"/>
+              </w:rPr>
+              <w:t>Hands-on Lab 5 — RAG Customer Care Chatbot (Cook &amp; Bake Academy): ingestion and the grounded chatbot. Slides 108–114</w:t>
+            </w:r>
+          </w:p>
+        </w:tc>
+      </w:tr>
+      <w:tr>
+        <w:tc>
+          <w:tcPr>
+            <w:tcW w:type="dxa" w:w="1440"/>
+            <w:shd w:val="clear" w:color="auto" w:fill="F3F5F8"/>
+          </w:tcPr>
+          <w:p>
+            <w:r/>
+            <w:r>
+              <w:rPr>
+                <w:rFonts w:ascii="Arial" w:hAnsi="Arial"/>
+                <w:b w:val="0"/>
+                <w:sz w:val="19"/>
+              </w:rPr>
+              <w:t>17:00–17:30</w:t>
+            </w:r>
+          </w:p>
+        </w:tc>
+        <w:tc>
+          <w:tcPr>
+            <w:tcW w:type="dxa" w:w="1152"/>
+            <w:shd w:val="clear" w:color="auto" w:fill="F3F5F8"/>
+          </w:tcPr>
+          <w:p>
+            <w:r/>
+            <w:r>
+              <w:rPr>
+                <w:rFonts w:ascii="Arial" w:hAnsi="Arial"/>
+                <w:b w:val="0"/>
+                <w:sz w:val="19"/>
+              </w:rPr>
+              <w:t>30 min</w:t>
+            </w:r>
+          </w:p>
+        </w:tc>
+        <w:tc>
+          <w:tcPr>
+            <w:tcW w:type="dxa" w:w="7056"/>
+            <w:shd w:val="clear" w:color="auto" w:fill="F3F5F8"/>
+          </w:tcPr>
+          <w:p>
+            <w:r/>
+            <w:r>
+              <w:rPr>
+                <w:rFonts w:ascii="Arial" w:hAnsi="Arial"/>
+                <w:b w:val="0"/>
+                <w:sz w:val="19"/>
+              </w:rPr>
+              <w:t>Course recap, taking it back to work, Q&amp;A. Slides 115–117</w:t>
             </w:r>
           </w:p>
         </w:tc>
@@ -2059,7 +2149,7 @@
           <w:color w:val="555B66"/>
           <w:sz w:val="19"/>
         </w:rPr>
-        <w:t>Day total: 7.5 instructional hours (9:30am – 5:30pm).  The 30-minute lunch break is excluded from instructional time.</w:t>
+        <w:t>Instructional time: 450 minutes (7.5 hours).  The day runs 9:30 am – 5:30 pm: the 30-minute lunch break is excluded from instructional time.</w:t>
       </w:r>
     </w:p>
     <w:p>
@@ -2221,15 +2311,14 @@
             <w:tcW w:type="dxa" w:w="2016"/>
           </w:tcPr>
           <w:p>
-            <w:r>
-              <w:t>Slides 20–58</w:t>
-            </w:r>
+            <w:r/>
             <w:r>
               <w:rPr>
                 <w:rFonts w:ascii="Arial" w:hAnsi="Arial"/>
                 <w:b w:val="0"/>
                 <w:sz w:val="19"/>
               </w:rPr>
+              <w:t>Slides 12–74</w:t>
             </w:r>
           </w:p>
         </w:tc>
@@ -2290,15 +2379,14 @@
             <w:tcW w:type="dxa" w:w="2016"/>
           </w:tcPr>
           <w:p>
-            <w:r>
-              <w:t>Slides 59–70</w:t>
-            </w:r>
+            <w:r/>
             <w:r>
               <w:rPr>
                 <w:rFonts w:ascii="Arial" w:hAnsi="Arial"/>
                 <w:b w:val="0"/>
                 <w:sz w:val="19"/>
               </w:rPr>
+              <w:t>Slides 75–98</w:t>
             </w:r>
           </w:p>
         </w:tc>
@@ -2359,15 +2447,14 @@
             <w:tcW w:type="dxa" w:w="2016"/>
           </w:tcPr>
           <w:p>
-            <w:r>
-              <w:t>Slides 71–83</w:t>
-            </w:r>
+            <w:r/>
             <w:r>
               <w:rPr>
                 <w:rFonts w:ascii="Arial" w:hAnsi="Arial"/>
                 <w:b w:val="0"/>
                 <w:sz w:val="19"/>
               </w:rPr>
+              <w:t>Slides 99–114</w:t>
             </w:r>
           </w:p>
         </w:tc>
@@ -2376,8 +2463,10 @@
     <w:sectPr>
       <w:footerReference w:type="default" r:id="rId11"/>
       <w:headerReference w:type="default" r:id="rId12"/>
-      <w:footerReference w:type="first" r:id="rId13"/>
-      <w:footerReference w:type="even" r:id="rId14"/>
+      <w:headerReference w:type="first" r:id="rId13"/>
+      <w:footerReference w:type="first" r:id="rId14"/>
+      <w:headerReference w:type="even" r:id="rId15"/>
+      <w:footerReference w:type="even" r:id="rId16"/>
       <w:pgSz w:w="12240" w:h="15840"/>
       <w:pgMar w:top="1440" w:right="1800" w:bottom="1440" w:left="1800" w:header="720" w:footer="720" w:gutter="0"/>
       <w:cols w:space="720"/>
@@ -2466,6 +2555,26 @@
 </file>
 
 <file path=word/header1.xml><?xml version="1.0" encoding="utf-8"?>
+<w:hdr xmlns:m="http://schemas.openxmlformats.org/officeDocument/2006/math" xmlns:mc="http://schemas.openxmlformats.org/markup-compatibility/2006" xmlns:mo="http://schemas.microsoft.com/office/mac/office/2008/main" xmlns:mv="urn:schemas-microsoft-com:mac:vml" xmlns:o="urn:schemas-microsoft-com:office:office" xmlns:r="http://schemas.openxmlformats.org/officeDocument/2006/relationships" xmlns:v="urn:schemas-microsoft-com:vml" xmlns:w10="urn:schemas-microsoft-com:office:word" xmlns:w14="http://schemas.microsoft.com/office/word/2010/wordml" xmlns:w="http://schemas.openxmlformats.org/wordprocessingml/2006/main" xmlns:wne="http://schemas.microsoft.com/office/word/2006/wordml" xmlns:wp14="http://schemas.microsoft.com/office/word/2010/wordprocessingDrawing" xmlns:wp="http://schemas.openxmlformats.org/drawingml/2006/wordprocessingDrawing" xmlns:wpc="http://schemas.microsoft.com/office/word/2010/wordprocessingCanvas" xmlns:wpg="http://schemas.microsoft.com/office/word/2010/wordprocessingGroup" xmlns:wpi="http://schemas.microsoft.com/office/word/2010/wordprocessingInk" xmlns:wps="http://schemas.microsoft.com/office/word/2010/wordprocessingShape" mc:Ignorable="w14 wp14">
+  <w:p>
+    <w:pPr>
+      <w:pStyle w:val="Header"/>
+    </w:pPr>
+  </w:p>
+</w:hdr>
+</file>
+
+<file path=word/header2.xml><?xml version="1.0" encoding="utf-8"?>
+<w:hdr xmlns:m="http://schemas.openxmlformats.org/officeDocument/2006/math" xmlns:mc="http://schemas.openxmlformats.org/markup-compatibility/2006" xmlns:mo="http://schemas.microsoft.com/office/mac/office/2008/main" xmlns:mv="urn:schemas-microsoft-com:mac:vml" xmlns:o="urn:schemas-microsoft-com:office:office" xmlns:r="http://schemas.openxmlformats.org/officeDocument/2006/relationships" xmlns:v="urn:schemas-microsoft-com:vml" xmlns:w10="urn:schemas-microsoft-com:office:word" xmlns:w14="http://schemas.microsoft.com/office/word/2010/wordml" xmlns:w="http://schemas.openxmlformats.org/wordprocessingml/2006/main" xmlns:wne="http://schemas.microsoft.com/office/word/2006/wordml" xmlns:wp14="http://schemas.microsoft.com/office/word/2010/wordprocessingDrawing" xmlns:wp="http://schemas.openxmlformats.org/drawingml/2006/wordprocessingDrawing" xmlns:wpc="http://schemas.microsoft.com/office/word/2010/wordprocessingCanvas" xmlns:wpg="http://schemas.microsoft.com/office/word/2010/wordprocessingGroup" xmlns:wpi="http://schemas.microsoft.com/office/word/2010/wordprocessingInk" xmlns:wps="http://schemas.microsoft.com/office/word/2010/wordprocessingShape" mc:Ignorable="w14 wp14">
+  <w:p>
+    <w:pPr>
+      <w:pStyle w:val="Header"/>
+    </w:pPr>
+  </w:p>
+</w:hdr>
+</file>
+
+<file path=word/header3.xml><?xml version="1.0" encoding="utf-8"?>
 <w:hdr xmlns:m="http://schemas.openxmlformats.org/officeDocument/2006/math" xmlns:mc="http://schemas.openxmlformats.org/markup-compatibility/2006" xmlns:mo="http://schemas.microsoft.com/office/mac/office/2008/main" xmlns:mv="urn:schemas-microsoft-com:mac:vml" xmlns:o="urn:schemas-microsoft-com:office:office" xmlns:r="http://schemas.openxmlformats.org/officeDocument/2006/relationships" xmlns:v="urn:schemas-microsoft-com:vml" xmlns:w10="urn:schemas-microsoft-com:office:word" xmlns:w14="http://schemas.microsoft.com/office/word/2010/wordml" xmlns:w="http://schemas.openxmlformats.org/wordprocessingml/2006/main" xmlns:wne="http://schemas.microsoft.com/office/word/2006/wordml" xmlns:wp14="http://schemas.microsoft.com/office/word/2010/wordprocessingDrawing" xmlns:wp="http://schemas.openxmlformats.org/drawingml/2006/wordprocessingDrawing" xmlns:wpc="http://schemas.microsoft.com/office/word/2010/wordprocessingCanvas" xmlns:wpg="http://schemas.microsoft.com/office/word/2010/wordprocessingGroup" xmlns:wpi="http://schemas.microsoft.com/office/word/2010/wordprocessingInk" xmlns:wps="http://schemas.microsoft.com/office/word/2010/wordprocessingShape" mc:Ignorable="w14 wp14">
   <w:p>
     <w:pPr>

</xml_diff>